<commit_message>
lista 01 i final
</commit_message>
<xml_diff>
--- a/docs/antigas/Lista01.docx
+++ b/docs/antigas/Lista01.docx
@@ -2438,7 +2438,18 @@
                     <w:sz w:val="24"/>
                     <w:szCs w:val="24"/>
                   </w:rPr>
-                  <m:t>2π</m:t>
+                  <m:t>2</m:t>
+                </m:r>
+                <m:r>
+                  <m:rPr>
+                    <m:sty m:val="bi"/>
+                  </m:rPr>
+                  <w:rPr>
+                    <w:rFonts w:ascii="Cambria Math"/>
+                    <w:sz w:val="24"/>
+                    <w:szCs w:val="24"/>
+                  </w:rPr>
+                  <m:t>π</m:t>
                 </m:r>
               </m:e>
             </m:rad>
@@ -4117,6 +4128,28 @@
                     <w:szCs w:val="24"/>
                   </w:rPr>
                   <m:t>n</m:t>
+                </m:r>
+                <m:r>
+                  <m:rPr>
+                    <m:sty m:val="bi"/>
+                  </m:rPr>
+                  <w:rPr>
+                    <w:rFonts w:ascii="Cambria Math"/>
+                    <w:sz w:val="24"/>
+                    <w:szCs w:val="24"/>
+                  </w:rPr>
+                  <m:t>-</m:t>
+                </m:r>
+                <m:r>
+                  <m:rPr>
+                    <m:sty m:val="bi"/>
+                  </m:rPr>
+                  <w:rPr>
+                    <w:rFonts w:ascii="Cambria Math"/>
+                    <w:sz w:val="24"/>
+                    <w:szCs w:val="24"/>
+                  </w:rPr>
+                  <m:t>1</m:t>
                 </m:r>
               </m:den>
             </m:f>

</xml_diff>